<commit_message>
pipeline lifecycle: Applied absorbs Submitted (kept as a confirmation tick), the interview season becomes five rounds; old names and old rows migrate
</commit_message>
<xml_diff>
--- a/docs/manuals/JobHuntWOW_Manual_RU.docx
+++ b/docs/manuals/JobHuntWOW_Manual_RU.docx
@@ -1348,8 +1348,8 @@
         </w:tblBorders>
       </w:tblPr>
       <w:tblGrid>
-        <w:gridCol w:w="2000"/>
-        <w:gridCol w:w="7200"/>
+        <w:gridCol w:w="2400"/>
+        <w:gridCol w:w="6800"/>
       </w:tblGrid>
       <w:tr>
         <w:trPr>
@@ -1357,7 +1357,7 @@
         </w:trPr>
         <w:tc>
           <w:tcPr>
-            <w:tcW w:type="dxa" w:w="2000"/>
+            <w:tcW w:type="dxa" w:w="2400"/>
             <w:shd w:fill="F8FAFC" w:val="clear"/>
             <w:tcMar>
               <w:top w:type="dxa" w:w="80"/>
@@ -1380,7 +1380,7 @@
         </w:tc>
         <w:tc>
           <w:tcPr>
-            <w:tcW w:type="dxa" w:w="7200"/>
+            <w:tcW w:type="dxa" w:w="6800"/>
             <w:shd w:fill="F8FAFC" w:val="clear"/>
             <w:tcMar>
               <w:top w:type="dxa" w:w="80"/>
@@ -1405,7 +1405,7 @@
       <w:tr>
         <w:tc>
           <w:tcPr>
-            <w:tcW w:type="dxa" w:w="2000"/>
+            <w:tcW w:type="dxa" w:w="2400"/>
             <w:tcMar>
               <w:top w:type="dxa" w:w="80"/>
               <w:left w:type="dxa" w:w="120"/>
@@ -1427,7 +1427,7 @@
         </w:tc>
         <w:tc>
           <w:tcPr>
-            <w:tcW w:type="dxa" w:w="7200"/>
+            <w:tcW w:type="dxa" w:w="6800"/>
             <w:tcMar>
               <w:top w:type="dxa" w:w="80"/>
               <w:left w:type="dxa" w:w="120"/>
@@ -1451,7 +1451,7 @@
       <w:tr>
         <w:tc>
           <w:tcPr>
-            <w:tcW w:type="dxa" w:w="2000"/>
+            <w:tcW w:type="dxa" w:w="2400"/>
             <w:tcMar>
               <w:top w:type="dxa" w:w="80"/>
               <w:left w:type="dxa" w:w="120"/>
@@ -1473,23 +1473,23 @@
         </w:tc>
         <w:tc>
           <w:tcPr>
-            <w:tcW w:type="dxa" w:w="7200"/>
-            <w:tcMar>
-              <w:top w:type="dxa" w:w="80"/>
-              <w:left w:type="dxa" w:w="120"/>
-              <w:bottom w:type="dxa" w:w="80"/>
-              <w:right w:type="dxa" w:w="120"/>
-            </w:tcMar>
-          </w:tcPr>
-          <w:p>
-            <w:r>
-              <w:rPr>
-                <w:b w:val="false"/>
-                <w:bCs w:val="false"/>
-                <w:sz w:val="19"/>
-                <w:szCs w:val="19"/>
-              </w:rPr>
-              <w:t xml:space="preserve">Отправлено (обычная подача)</w:t>
+            <w:tcW w:type="dxa" w:w="6800"/>
+            <w:tcMar>
+              <w:top w:type="dxa" w:w="80"/>
+              <w:left w:type="dxa" w:w="120"/>
+              <w:bottom w:type="dxa" w:w="80"/>
+              <w:right w:type="dxa" w:w="120"/>
+            </w:tcMar>
+          </w:tcPr>
+          <w:p>
+            <w:r>
+              <w:rPr>
+                <w:b w:val="false"/>
+                <w:bCs w:val="false"/>
+                <w:sz w:val="19"/>
+                <w:szCs w:val="19"/>
+              </w:rPr>
+              <w:t xml:space="preserve">Отправлено работодателю. Галочка ✓ на карточке — сайт работодателя подтвердил приём</w:t>
             </w:r>
           </w:p>
         </w:tc>
@@ -1497,45 +1497,45 @@
       <w:tr>
         <w:tc>
           <w:tcPr>
-            <w:tcW w:type="dxa" w:w="2000"/>
-            <w:tcMar>
-              <w:top w:type="dxa" w:w="80"/>
-              <w:left w:type="dxa" w:w="120"/>
-              <w:bottom w:type="dxa" w:w="80"/>
-              <w:right w:type="dxa" w:w="120"/>
-            </w:tcMar>
-          </w:tcPr>
-          <w:p>
-            <w:r>
-              <w:rPr>
-                <w:b w:val="false"/>
-                <w:bCs w:val="false"/>
-                <w:sz w:val="19"/>
-                <w:szCs w:val="19"/>
-              </w:rPr>
-              <w:t xml:space="preserve">Submitted</w:t>
-            </w:r>
-          </w:p>
-        </w:tc>
-        <w:tc>
-          <w:tcPr>
-            <w:tcW w:type="dxa" w:w="7200"/>
-            <w:tcMar>
-              <w:top w:type="dxa" w:w="80"/>
-              <w:left w:type="dxa" w:w="120"/>
-              <w:bottom w:type="dxa" w:w="80"/>
-              <w:right w:type="dxa" w:w="120"/>
-            </w:tcMar>
-          </w:tcPr>
-          <w:p>
-            <w:r>
-              <w:rPr>
-                <w:b w:val="false"/>
-                <w:bCs w:val="false"/>
-                <w:sz w:val="19"/>
-                <w:szCs w:val="19"/>
-              </w:rPr>
-              <w:t xml:space="preserve">Отправлено и подтверждено самим сайтом работодателя</w:t>
+            <w:tcW w:type="dxa" w:w="2400"/>
+            <w:tcMar>
+              <w:top w:type="dxa" w:w="80"/>
+              <w:left w:type="dxa" w:w="120"/>
+              <w:bottom w:type="dxa" w:w="80"/>
+              <w:right w:type="dxa" w:w="120"/>
+            </w:tcMar>
+          </w:tcPr>
+          <w:p>
+            <w:r>
+              <w:rPr>
+                <w:b w:val="false"/>
+                <w:bCs w:val="false"/>
+                <w:sz w:val="19"/>
+                <w:szCs w:val="19"/>
+              </w:rPr>
+              <w:t xml:space="preserve">HR screen</w:t>
+            </w:r>
+          </w:p>
+        </w:tc>
+        <w:tc>
+          <w:tcPr>
+            <w:tcW w:type="dxa" w:w="6800"/>
+            <w:tcMar>
+              <w:top w:type="dxa" w:w="80"/>
+              <w:left w:type="dxa" w:w="120"/>
+              <w:bottom w:type="dxa" w:w="80"/>
+              <w:right w:type="dxa" w:w="120"/>
+            </w:tcMar>
+          </w:tcPr>
+          <w:p>
+            <w:r>
+              <w:rPr>
+                <w:b w:val="false"/>
+                <w:bCs w:val="false"/>
+                <w:sz w:val="19"/>
+                <w:szCs w:val="19"/>
+              </w:rPr>
+              <w:t xml:space="preserve">Звонок рекрутёра</w:t>
             </w:r>
           </w:p>
         </w:tc>
@@ -1543,45 +1543,45 @@
       <w:tr>
         <w:tc>
           <w:tcPr>
-            <w:tcW w:type="dxa" w:w="2000"/>
-            <w:tcMar>
-              <w:top w:type="dxa" w:w="80"/>
-              <w:left w:type="dxa" w:w="120"/>
-              <w:bottom w:type="dxa" w:w="80"/>
-              <w:right w:type="dxa" w:w="120"/>
-            </w:tcMar>
-          </w:tcPr>
-          <w:p>
-            <w:r>
-              <w:rPr>
-                <w:b w:val="false"/>
-                <w:bCs w:val="false"/>
-                <w:sz w:val="19"/>
-                <w:szCs w:val="19"/>
-              </w:rPr>
-              <w:t xml:space="preserve">Interview</w:t>
-            </w:r>
-          </w:p>
-        </w:tc>
-        <w:tc>
-          <w:tcPr>
-            <w:tcW w:type="dxa" w:w="7200"/>
-            <w:tcMar>
-              <w:top w:type="dxa" w:w="80"/>
-              <w:left w:type="dxa" w:w="120"/>
-              <w:bottom w:type="dxa" w:w="80"/>
-              <w:right w:type="dxa" w:w="120"/>
-            </w:tcMar>
-          </w:tcPr>
-          <w:p>
-            <w:r>
-              <w:rPr>
-                <w:b w:val="false"/>
-                <w:bCs w:val="false"/>
-                <w:sz w:val="19"/>
-                <w:szCs w:val="19"/>
-              </w:rPr>
-              <w:t xml:space="preserve">Назначено или идёт интервью</w:t>
+            <w:tcW w:type="dxa" w:w="2400"/>
+            <w:tcMar>
+              <w:top w:type="dxa" w:w="80"/>
+              <w:left w:type="dxa" w:w="120"/>
+              <w:bottom w:type="dxa" w:w="80"/>
+              <w:right w:type="dxa" w:w="120"/>
+            </w:tcMar>
+          </w:tcPr>
+          <w:p>
+            <w:r>
+              <w:rPr>
+                <w:b w:val="false"/>
+                <w:bCs w:val="false"/>
+                <w:sz w:val="19"/>
+                <w:szCs w:val="19"/>
+              </w:rPr>
+              <w:t xml:space="preserve">Technical</w:t>
+            </w:r>
+          </w:p>
+        </w:tc>
+        <w:tc>
+          <w:tcPr>
+            <w:tcW w:type="dxa" w:w="6800"/>
+            <w:tcMar>
+              <w:top w:type="dxa" w:w="80"/>
+              <w:left w:type="dxa" w:w="120"/>
+              <w:bottom w:type="dxa" w:w="80"/>
+              <w:right w:type="dxa" w:w="120"/>
+            </w:tcMar>
+          </w:tcPr>
+          <w:p>
+            <w:r>
+              <w:rPr>
+                <w:b w:val="false"/>
+                <w:bCs w:val="false"/>
+                <w:sz w:val="19"/>
+                <w:szCs w:val="19"/>
+              </w:rPr>
+              <w:t xml:space="preserve">Техническое интервью</w:t>
             </w:r>
           </w:p>
         </w:tc>
@@ -1589,45 +1589,45 @@
       <w:tr>
         <w:tc>
           <w:tcPr>
-            <w:tcW w:type="dxa" w:w="2000"/>
-            <w:tcMar>
-              <w:top w:type="dxa" w:w="80"/>
-              <w:left w:type="dxa" w:w="120"/>
-              <w:bottom w:type="dxa" w:w="80"/>
-              <w:right w:type="dxa" w:w="120"/>
-            </w:tcMar>
-          </w:tcPr>
-          <w:p>
-            <w:r>
-              <w:rPr>
-                <w:b w:val="false"/>
-                <w:bCs w:val="false"/>
-                <w:sz w:val="19"/>
-                <w:szCs w:val="19"/>
-              </w:rPr>
-              <w:t xml:space="preserve">Offer</w:t>
-            </w:r>
-          </w:p>
-        </w:tc>
-        <w:tc>
-          <w:tcPr>
-            <w:tcW w:type="dxa" w:w="7200"/>
-            <w:tcMar>
-              <w:top w:type="dxa" w:w="80"/>
-              <w:left w:type="dxa" w:w="120"/>
-              <w:bottom w:type="dxa" w:w="80"/>
-              <w:right w:type="dxa" w:w="120"/>
-            </w:tcMar>
-          </w:tcPr>
-          <w:p>
-            <w:r>
-              <w:rPr>
-                <w:b w:val="false"/>
-                <w:bCs w:val="false"/>
-                <w:sz w:val="19"/>
-                <w:szCs w:val="19"/>
-              </w:rPr>
-              <w:t xml:space="preserve">Предложение</w:t>
+            <w:tcW w:type="dxa" w:w="2400"/>
+            <w:tcMar>
+              <w:top w:type="dxa" w:w="80"/>
+              <w:left w:type="dxa" w:w="120"/>
+              <w:bottom w:type="dxa" w:w="80"/>
+              <w:right w:type="dxa" w:w="120"/>
+            </w:tcMar>
+          </w:tcPr>
+          <w:p>
+            <w:r>
+              <w:rPr>
+                <w:b w:val="false"/>
+                <w:bCs w:val="false"/>
+                <w:sz w:val="19"/>
+                <w:szCs w:val="19"/>
+              </w:rPr>
+              <w:t xml:space="preserve">Task / presentation</w:t>
+            </w:r>
+          </w:p>
+        </w:tc>
+        <w:tc>
+          <w:tcPr>
+            <w:tcW w:type="dxa" w:w="6800"/>
+            <w:tcMar>
+              <w:top w:type="dxa" w:w="80"/>
+              <w:left w:type="dxa" w:w="120"/>
+              <w:bottom w:type="dxa" w:w="80"/>
+              <w:right w:type="dxa" w:w="120"/>
+            </w:tcMar>
+          </w:tcPr>
+          <w:p>
+            <w:r>
+              <w:rPr>
+                <w:b w:val="false"/>
+                <w:bCs w:val="false"/>
+                <w:sz w:val="19"/>
+                <w:szCs w:val="19"/>
+              </w:rPr>
+              <w:t xml:space="preserve">Тестовое задание или презентация</w:t>
             </w:r>
           </w:p>
         </w:tc>
@@ -1635,7 +1635,145 @@
       <w:tr>
         <w:tc>
           <w:tcPr>
-            <w:tcW w:type="dxa" w:w="2000"/>
+            <w:tcW w:type="dxa" w:w="2400"/>
+            <w:tcMar>
+              <w:top w:type="dxa" w:w="80"/>
+              <w:left w:type="dxa" w:w="120"/>
+              <w:bottom w:type="dxa" w:w="80"/>
+              <w:right w:type="dxa" w:w="120"/>
+            </w:tcMar>
+          </w:tcPr>
+          <w:p>
+            <w:r>
+              <w:rPr>
+                <w:b w:val="false"/>
+                <w:bCs w:val="false"/>
+                <w:sz w:val="19"/>
+                <w:szCs w:val="19"/>
+              </w:rPr>
+              <w:t xml:space="preserve">Hiring manager</w:t>
+            </w:r>
+          </w:p>
+        </w:tc>
+        <w:tc>
+          <w:tcPr>
+            <w:tcW w:type="dxa" w:w="6800"/>
+            <w:tcMar>
+              <w:top w:type="dxa" w:w="80"/>
+              <w:left w:type="dxa" w:w="120"/>
+              <w:bottom w:type="dxa" w:w="80"/>
+              <w:right w:type="dxa" w:w="120"/>
+            </w:tcMar>
+          </w:tcPr>
+          <w:p>
+            <w:r>
+              <w:rPr>
+                <w:b w:val="false"/>
+                <w:bCs w:val="false"/>
+                <w:sz w:val="19"/>
+                <w:szCs w:val="19"/>
+              </w:rPr>
+              <w:t xml:space="preserve">Интервью с будущим руководителем</w:t>
+            </w:r>
+          </w:p>
+        </w:tc>
+      </w:tr>
+      <w:tr>
+        <w:tc>
+          <w:tcPr>
+            <w:tcW w:type="dxa" w:w="2400"/>
+            <w:tcMar>
+              <w:top w:type="dxa" w:w="80"/>
+              <w:left w:type="dxa" w:w="120"/>
+              <w:bottom w:type="dxa" w:w="80"/>
+              <w:right w:type="dxa" w:w="120"/>
+            </w:tcMar>
+          </w:tcPr>
+          <w:p>
+            <w:r>
+              <w:rPr>
+                <w:b w:val="false"/>
+                <w:bCs w:val="false"/>
+                <w:sz w:val="19"/>
+                <w:szCs w:val="19"/>
+              </w:rPr>
+              <w:t xml:space="preserve">Final panel</w:t>
+            </w:r>
+          </w:p>
+        </w:tc>
+        <w:tc>
+          <w:tcPr>
+            <w:tcW w:type="dxa" w:w="6800"/>
+            <w:tcMar>
+              <w:top w:type="dxa" w:w="80"/>
+              <w:left w:type="dxa" w:w="120"/>
+              <w:bottom w:type="dxa" w:w="80"/>
+              <w:right w:type="dxa" w:w="120"/>
+            </w:tcMar>
+          </w:tcPr>
+          <w:p>
+            <w:r>
+              <w:rPr>
+                <w:b w:val="false"/>
+                <w:bCs w:val="false"/>
+                <w:sz w:val="19"/>
+                <w:szCs w:val="19"/>
+              </w:rPr>
+              <w:t xml:space="preserve">Финальный раунд, панель</w:t>
+            </w:r>
+          </w:p>
+        </w:tc>
+      </w:tr>
+      <w:tr>
+        <w:tc>
+          <w:tcPr>
+            <w:tcW w:type="dxa" w:w="2400"/>
+            <w:tcMar>
+              <w:top w:type="dxa" w:w="80"/>
+              <w:left w:type="dxa" w:w="120"/>
+              <w:bottom w:type="dxa" w:w="80"/>
+              <w:right w:type="dxa" w:w="120"/>
+            </w:tcMar>
+          </w:tcPr>
+          <w:p>
+            <w:r>
+              <w:rPr>
+                <w:b w:val="false"/>
+                <w:bCs w:val="false"/>
+                <w:sz w:val="19"/>
+                <w:szCs w:val="19"/>
+              </w:rPr>
+              <w:t xml:space="preserve">Offer</w:t>
+            </w:r>
+          </w:p>
+        </w:tc>
+        <w:tc>
+          <w:tcPr>
+            <w:tcW w:type="dxa" w:w="6800"/>
+            <w:tcMar>
+              <w:top w:type="dxa" w:w="80"/>
+              <w:left w:type="dxa" w:w="120"/>
+              <w:bottom w:type="dxa" w:w="80"/>
+              <w:right w:type="dxa" w:w="120"/>
+            </w:tcMar>
+          </w:tcPr>
+          <w:p>
+            <w:r>
+              <w:rPr>
+                <w:b w:val="false"/>
+                <w:bCs w:val="false"/>
+                <w:sz w:val="19"/>
+                <w:szCs w:val="19"/>
+              </w:rPr>
+              <w:t xml:space="preserve">Предложение</w:t>
+            </w:r>
+          </w:p>
+        </w:tc>
+      </w:tr>
+      <w:tr>
+        <w:tc>
+          <w:tcPr>
+            <w:tcW w:type="dxa" w:w="2400"/>
             <w:tcMar>
               <w:top w:type="dxa" w:w="80"/>
               <w:left w:type="dxa" w:w="120"/>
@@ -1657,28 +1795,40 @@
         </w:tc>
         <w:tc>
           <w:tcPr>
-            <w:tcW w:type="dxa" w:w="7200"/>
-            <w:tcMar>
-              <w:top w:type="dxa" w:w="80"/>
-              <w:left w:type="dxa" w:w="120"/>
-              <w:bottom w:type="dxa" w:w="80"/>
-              <w:right w:type="dxa" w:w="120"/>
-            </w:tcMar>
-          </w:tcPr>
-          <w:p>
-            <w:r>
-              <w:rPr>
-                <w:b w:val="false"/>
-                <w:bCs w:val="false"/>
-                <w:sz w:val="19"/>
-                <w:szCs w:val="19"/>
-              </w:rPr>
-              <w:t xml:space="preserve">Отказ</w:t>
+            <w:tcW w:type="dxa" w:w="6800"/>
+            <w:tcMar>
+              <w:top w:type="dxa" w:w="80"/>
+              <w:left w:type="dxa" w:w="120"/>
+              <w:bottom w:type="dxa" w:w="80"/>
+              <w:right w:type="dxa" w:w="120"/>
+            </w:tcMar>
+          </w:tcPr>
+          <w:p>
+            <w:r>
+              <w:rPr>
+                <w:b w:val="false"/>
+                <w:bCs w:val="false"/>
+                <w:sz w:val="19"/>
+                <w:szCs w:val="19"/>
+              </w:rPr>
+              <w:t xml:space="preserve">Отказ (на любом шаге)</w:t>
             </w:r>
           </w:p>
         </w:tc>
       </w:tr>
     </w:tbl>
+    <w:p>
+      <w:r>
+        <w:rPr>
+          <w:i/>
+          <w:iCs/>
+          <w:color w:val="475569"/>
+          <w:sz w:val="19"/>
+          <w:szCs w:val="19"/>
+        </w:rPr>
+        <w:t xml:space="preserve">Раньше «Applied» и «Submitted» были двумя колонками для одного события. Подтверждение сайта — это доказательство об отправке, а не следующий шаг, поэтому оно стало галочкой на карточке и строкой в вечернем письме. Старые записи переехали автоматически: всё, что было в «Submitted», теперь в «Applied» с галочкой, а «Interview» — в «HR screen».</w:t>
+      </w:r>
+    </w:p>
     <w:p>
       <w:pPr>
         <w:pStyle w:val="Heading2"/>

</xml_diff>

<commit_message>
pipeline: an offer is not the end — contract negotiation and signed are stages of their own
</commit_message>
<xml_diff>
--- a/docs/manuals/JobHuntWOW_Manual_RU.docx
+++ b/docs/manuals/JobHuntWOW_Manual_RU.docx
@@ -1765,7 +1765,7 @@
                 <w:sz w:val="19"/>
                 <w:szCs w:val="19"/>
               </w:rPr>
-              <w:t xml:space="preserve">Предложение</w:t>
+              <w:t xml:space="preserve">Предложение получено</w:t>
             </w:r>
           </w:p>
         </w:tc>
@@ -1789,6 +1789,98 @@
                 <w:sz w:val="19"/>
                 <w:szCs w:val="19"/>
               </w:rPr>
+              <w:t xml:space="preserve">Contract negotiation</w:t>
+            </w:r>
+          </w:p>
+        </w:tc>
+        <w:tc>
+          <w:tcPr>
+            <w:tcW w:type="dxa" w:w="6800"/>
+            <w:tcMar>
+              <w:top w:type="dxa" w:w="80"/>
+              <w:left w:type="dxa" w:w="120"/>
+              <w:bottom w:type="dxa" w:w="80"/>
+              <w:right w:type="dxa" w:w="120"/>
+            </w:tcMar>
+          </w:tcPr>
+          <w:p>
+            <w:r>
+              <w:rPr>
+                <w:b w:val="false"/>
+                <w:bCs w:val="false"/>
+                <w:sz w:val="19"/>
+                <w:szCs w:val="19"/>
+              </w:rPr>
+              <w:t xml:space="preserve">Переговоры: деньги, дата выхода, срок уведомления, бумаги</w:t>
+            </w:r>
+          </w:p>
+        </w:tc>
+      </w:tr>
+      <w:tr>
+        <w:tc>
+          <w:tcPr>
+            <w:tcW w:type="dxa" w:w="2400"/>
+            <w:tcMar>
+              <w:top w:type="dxa" w:w="80"/>
+              <w:left w:type="dxa" w:w="120"/>
+              <w:bottom w:type="dxa" w:w="80"/>
+              <w:right w:type="dxa" w:w="120"/>
+            </w:tcMar>
+          </w:tcPr>
+          <w:p>
+            <w:r>
+              <w:rPr>
+                <w:b w:val="false"/>
+                <w:bCs w:val="false"/>
+                <w:sz w:val="19"/>
+                <w:szCs w:val="19"/>
+              </w:rPr>
+              <w:t xml:space="preserve">Signed</w:t>
+            </w:r>
+          </w:p>
+        </w:tc>
+        <w:tc>
+          <w:tcPr>
+            <w:tcW w:type="dxa" w:w="6800"/>
+            <w:tcMar>
+              <w:top w:type="dxa" w:w="80"/>
+              <w:left w:type="dxa" w:w="120"/>
+              <w:bottom w:type="dxa" w:w="80"/>
+              <w:right w:type="dxa" w:w="120"/>
+            </w:tcMar>
+          </w:tcPr>
+          <w:p>
+            <w:r>
+              <w:rPr>
+                <w:b w:val="false"/>
+                <w:bCs w:val="false"/>
+                <w:sz w:val="19"/>
+                <w:szCs w:val="19"/>
+              </w:rPr>
+              <w:t xml:space="preserve">Контракт подписан — работа ваша</w:t>
+            </w:r>
+          </w:p>
+        </w:tc>
+      </w:tr>
+      <w:tr>
+        <w:tc>
+          <w:tcPr>
+            <w:tcW w:type="dxa" w:w="2400"/>
+            <w:tcMar>
+              <w:top w:type="dxa" w:w="80"/>
+              <w:left w:type="dxa" w:w="120"/>
+              <w:bottom w:type="dxa" w:w="80"/>
+              <w:right w:type="dxa" w:w="120"/>
+            </w:tcMar>
+          </w:tcPr>
+          <w:p>
+            <w:r>
+              <w:rPr>
+                <w:b w:val="false"/>
+                <w:bCs w:val="false"/>
+                <w:sz w:val="19"/>
+                <w:szCs w:val="19"/>
+              </w:rPr>
               <w:t xml:space="preserve">Rejected</w:t>
             </w:r>
           </w:p>
@@ -1817,6 +1909,18 @@
         </w:tc>
       </w:tr>
     </w:tbl>
+    <w:p>
+      <w:r>
+        <w:rPr>
+          <w:i/>
+          <w:iCs/>
+          <w:color w:val="475569"/>
+          <w:sz w:val="19"/>
+          <w:szCs w:val="19"/>
+        </w:rPr>
+        <w:t xml:space="preserve">Оффер — это ещё не работа. Две недели между «вы нам подходите» и подписью решают зарплату, дату выхода и срок уведомления текущему работодателю; у этих разговоров теперь свои колонки.</w:t>
+      </w:r>
+    </w:p>
     <w:p>
       <w:r>
         <w:rPr>

</xml_diff>